<commit_message>
databricks and vscode setup
</commit_message>
<xml_diff>
--- a/Signing up to databricks.docx
+++ b/Signing up to databricks.docx
@@ -15,6 +15,9 @@
     <w:p/>
     <w:p>
       <w:r>
+        <w:rPr>
+          <w:noProof/>
+        </w:rPr>
         <w:drawing>
           <wp:inline distT="0" distB="0" distL="0" distR="0" wp14:anchorId="3164A22D" wp14:editId="7CAE60CD">
             <wp:extent cx="4496190" cy="4953429"/>
@@ -54,6 +57,9 @@
     </w:p>
     <w:p>
       <w:r>
+        <w:rPr>
+          <w:noProof/>
+        </w:rPr>
         <w:drawing>
           <wp:inline distT="0" distB="0" distL="0" distR="0" wp14:anchorId="2A16E2B3" wp14:editId="2E3C8DDA">
             <wp:extent cx="5731510" cy="3060065"/>
@@ -91,6 +97,532 @@
         </w:drawing>
       </w:r>
     </w:p>
+    <w:p>
+      <w:pPr>
+        <w:rPr>
+          <w:b/>
+          <w:bCs/>
+        </w:rPr>
+      </w:pPr>
+      <w:r>
+        <w:lastRenderedPageBreak/>
+        <w:t xml:space="preserve">Creating </w:t>
+      </w:r>
+      <w:proofErr w:type="spellStart"/>
+      <w:r>
+        <w:t>catalog</w:t>
+      </w:r>
+      <w:proofErr w:type="spellEnd"/>
+      <w:r>
+        <w:t xml:space="preserve"> - </w:t>
+      </w:r>
+      <w:proofErr w:type="spellStart"/>
+      <w:r>
+        <w:t>pei</w:t>
+      </w:r>
+      <w:proofErr w:type="spellEnd"/>
+    </w:p>
+    <w:p>
+      <w:r>
+        <w:drawing>
+          <wp:inline distT="0" distB="0" distL="0" distR="0" wp14:anchorId="2A307AF3" wp14:editId="6E36B6A5">
+            <wp:extent cx="5731510" cy="2913380"/>
+            <wp:effectExtent l="0" t="0" r="2540" b="1270"/>
+            <wp:docPr id="2090545631" name="Picture 1" descr="The image displays a Databricks interface with various options such as Q Search, Notebooks, Recents, and a Catalog creation page.&#10;&#10;AI-generated content may be incorrect."/>
+            <wp:cNvGraphicFramePr>
+              <a:graphicFrameLocks xmlns:a="http://schemas.openxmlformats.org/drawingml/2006/main" noChangeAspect="1"/>
+            </wp:cNvGraphicFramePr>
+            <a:graphic xmlns:a="http://schemas.openxmlformats.org/drawingml/2006/main">
+              <a:graphicData uri="http://schemas.openxmlformats.org/drawingml/2006/picture">
+                <pic:pic xmlns:pic="http://schemas.openxmlformats.org/drawingml/2006/picture">
+                  <pic:nvPicPr>
+                    <pic:cNvPr id="2090545631" name="Picture 1" descr="The image displays a Databricks interface with various options such as Q Search, Notebooks, Recents, and a Catalog creation page.&#10;&#10;AI-generated content may be incorrect."/>
+                    <pic:cNvPicPr/>
+                  </pic:nvPicPr>
+                  <pic:blipFill>
+                    <a:blip r:embed="rId6"/>
+                    <a:stretch>
+                      <a:fillRect/>
+                    </a:stretch>
+                  </pic:blipFill>
+                  <pic:spPr>
+                    <a:xfrm>
+                      <a:off x="0" y="0"/>
+                      <a:ext cx="5731510" cy="2913380"/>
+                    </a:xfrm>
+                    <a:prstGeom prst="rect">
+                      <a:avLst/>
+                    </a:prstGeom>
+                  </pic:spPr>
+                </pic:pic>
+              </a:graphicData>
+            </a:graphic>
+          </wp:inline>
+        </w:drawing>
+      </w:r>
+    </w:p>
+    <w:p>
+      <w:r>
+        <w:drawing>
+          <wp:inline distT="0" distB="0" distL="0" distR="0" wp14:anchorId="2DA900AA" wp14:editId="70413890">
+            <wp:extent cx="5731510" cy="2579370"/>
+            <wp:effectExtent l="0" t="0" r="2540" b="0"/>
+            <wp:docPr id="1434615156" name="Picture 1" descr="The image displays a Databricks interface with various options such as search, workspaces, schemas, and query history.&#10;&#10;AI-generated content may be incorrect."/>
+            <wp:cNvGraphicFramePr>
+              <a:graphicFrameLocks xmlns:a="http://schemas.openxmlformats.org/drawingml/2006/main" noChangeAspect="1"/>
+            </wp:cNvGraphicFramePr>
+            <a:graphic xmlns:a="http://schemas.openxmlformats.org/drawingml/2006/main">
+              <a:graphicData uri="http://schemas.openxmlformats.org/drawingml/2006/picture">
+                <pic:pic xmlns:pic="http://schemas.openxmlformats.org/drawingml/2006/picture">
+                  <pic:nvPicPr>
+                    <pic:cNvPr id="1434615156" name="Picture 1" descr="The image displays a Databricks interface with various options such as search, workspaces, schemas, and query history.&#10;&#10;AI-generated content may be incorrect."/>
+                    <pic:cNvPicPr/>
+                  </pic:nvPicPr>
+                  <pic:blipFill>
+                    <a:blip r:embed="rId7"/>
+                    <a:stretch>
+                      <a:fillRect/>
+                    </a:stretch>
+                  </pic:blipFill>
+                  <pic:spPr>
+                    <a:xfrm>
+                      <a:off x="0" y="0"/>
+                      <a:ext cx="5731510" cy="2579370"/>
+                    </a:xfrm>
+                    <a:prstGeom prst="rect">
+                      <a:avLst/>
+                    </a:prstGeom>
+                  </pic:spPr>
+                </pic:pic>
+              </a:graphicData>
+            </a:graphic>
+          </wp:inline>
+        </w:drawing>
+      </w:r>
+    </w:p>
+    <w:p>
+      <w:r>
+        <w:t>Creating Source Schema</w:t>
+      </w:r>
+    </w:p>
+    <w:p>
+      <w:r>
+        <w:lastRenderedPageBreak/>
+        <w:drawing>
+          <wp:inline distT="0" distB="0" distL="0" distR="0" wp14:anchorId="0FCD73F3" wp14:editId="7C8FF1DD">
+            <wp:extent cx="5731510" cy="4900930"/>
+            <wp:effectExtent l="0" t="0" r="2540" b="0"/>
+            <wp:docPr id="2002271396" name="Picture 1" descr="The image displays a user interface for creating a new schema in Unity Catalog, with options for naming, selecting storage locations, and setting up external locations.&#10;&#10;AI-generated content may be incorrect."/>
+            <wp:cNvGraphicFramePr>
+              <a:graphicFrameLocks xmlns:a="http://schemas.openxmlformats.org/drawingml/2006/main" noChangeAspect="1"/>
+            </wp:cNvGraphicFramePr>
+            <a:graphic xmlns:a="http://schemas.openxmlformats.org/drawingml/2006/main">
+              <a:graphicData uri="http://schemas.openxmlformats.org/drawingml/2006/picture">
+                <pic:pic xmlns:pic="http://schemas.openxmlformats.org/drawingml/2006/picture">
+                  <pic:nvPicPr>
+                    <pic:cNvPr id="2002271396" name="Picture 1" descr="The image displays a user interface for creating a new schema in Unity Catalog, with options for naming, selecting storage locations, and setting up external locations.&#10;&#10;AI-generated content may be incorrect."/>
+                    <pic:cNvPicPr/>
+                  </pic:nvPicPr>
+                  <pic:blipFill>
+                    <a:blip r:embed="rId8"/>
+                    <a:stretch>
+                      <a:fillRect/>
+                    </a:stretch>
+                  </pic:blipFill>
+                  <pic:spPr>
+                    <a:xfrm>
+                      <a:off x="0" y="0"/>
+                      <a:ext cx="5731510" cy="4900930"/>
+                    </a:xfrm>
+                    <a:prstGeom prst="rect">
+                      <a:avLst/>
+                    </a:prstGeom>
+                  </pic:spPr>
+                </pic:pic>
+              </a:graphicData>
+            </a:graphic>
+          </wp:inline>
+        </w:drawing>
+      </w:r>
+    </w:p>
+    <w:p>
+      <w:r>
+        <w:t>Creating volume</w:t>
+      </w:r>
+    </w:p>
+    <w:p>
+      <w:r>
+        <w:drawing>
+          <wp:inline distT="0" distB="0" distL="0" distR="0" wp14:anchorId="2FA230C9" wp14:editId="4E982F23">
+            <wp:extent cx="3261643" cy="1546994"/>
+            <wp:effectExtent l="0" t="0" r="0" b="0"/>
+            <wp:docPr id="168453072" name="Picture 1" descr="pei.src.raw_files&#10;&#10;AI-generated content may be incorrect."/>
+            <wp:cNvGraphicFramePr>
+              <a:graphicFrameLocks xmlns:a="http://schemas.openxmlformats.org/drawingml/2006/main" noChangeAspect="1"/>
+            </wp:cNvGraphicFramePr>
+            <a:graphic xmlns:a="http://schemas.openxmlformats.org/drawingml/2006/main">
+              <a:graphicData uri="http://schemas.openxmlformats.org/drawingml/2006/picture">
+                <pic:pic xmlns:pic="http://schemas.openxmlformats.org/drawingml/2006/picture">
+                  <pic:nvPicPr>
+                    <pic:cNvPr id="168453072" name="Picture 1" descr="pei.src.raw_files&#10;&#10;AI-generated content may be incorrect."/>
+                    <pic:cNvPicPr/>
+                  </pic:nvPicPr>
+                  <pic:blipFill>
+                    <a:blip r:embed="rId9"/>
+                    <a:stretch>
+                      <a:fillRect/>
+                    </a:stretch>
+                  </pic:blipFill>
+                  <pic:spPr>
+                    <a:xfrm>
+                      <a:off x="0" y="0"/>
+                      <a:ext cx="3261643" cy="1546994"/>
+                    </a:xfrm>
+                    <a:prstGeom prst="rect">
+                      <a:avLst/>
+                    </a:prstGeom>
+                  </pic:spPr>
+                </pic:pic>
+              </a:graphicData>
+            </a:graphic>
+          </wp:inline>
+        </w:drawing>
+      </w:r>
+    </w:p>
+    <w:p>
+      <w:r>
+        <w:lastRenderedPageBreak/>
+        <w:drawing>
+          <wp:inline distT="0" distB="0" distL="0" distR="0" wp14:anchorId="651722D7" wp14:editId="2D43FCD3">
+            <wp:extent cx="5731510" cy="2554605"/>
+            <wp:effectExtent l="0" t="0" r="2540" b="0"/>
+            <wp:docPr id="1997815265" name="Picture 1" descr="The image displays a file and directory structure within a serverless application environment, specifically within the 'pei' directory, showing a file named 'raw_files' and a subdirectory 'samples'.&#10;&#10;AI-generated content may be incorrect."/>
+            <wp:cNvGraphicFramePr>
+              <a:graphicFrameLocks xmlns:a="http://schemas.openxmlformats.org/drawingml/2006/main" noChangeAspect="1"/>
+            </wp:cNvGraphicFramePr>
+            <a:graphic xmlns:a="http://schemas.openxmlformats.org/drawingml/2006/main">
+              <a:graphicData uri="http://schemas.openxmlformats.org/drawingml/2006/picture">
+                <pic:pic xmlns:pic="http://schemas.openxmlformats.org/drawingml/2006/picture">
+                  <pic:nvPicPr>
+                    <pic:cNvPr id="1997815265" name="Picture 1" descr="The image displays a file and directory structure within a serverless application environment, specifically within the 'pei' directory, showing a file named 'raw_files' and a subdirectory 'samples'.&#10;&#10;AI-generated content may be incorrect."/>
+                    <pic:cNvPicPr/>
+                  </pic:nvPicPr>
+                  <pic:blipFill>
+                    <a:blip r:embed="rId10"/>
+                    <a:stretch>
+                      <a:fillRect/>
+                    </a:stretch>
+                  </pic:blipFill>
+                  <pic:spPr>
+                    <a:xfrm>
+                      <a:off x="0" y="0"/>
+                      <a:ext cx="5731510" cy="2554605"/>
+                    </a:xfrm>
+                    <a:prstGeom prst="rect">
+                      <a:avLst/>
+                    </a:prstGeom>
+                  </pic:spPr>
+                </pic:pic>
+              </a:graphicData>
+            </a:graphic>
+          </wp:inline>
+        </w:drawing>
+      </w:r>
+    </w:p>
+    <w:p>
+      <w:r>
+        <w:t xml:space="preserve">Uploading raw files </w:t>
+      </w:r>
+    </w:p>
+    <w:p>
+      <w:r>
+        <w:drawing>
+          <wp:inline distT="0" distB="0" distL="0" distR="0" wp14:anchorId="0B62BAD6" wp14:editId="091AC199">
+            <wp:extent cx="5731510" cy="2964180"/>
+            <wp:effectExtent l="0" t="0" r="2540" b="7620"/>
+            <wp:docPr id="983270547" name="Picture 1" descr="The image displays a web interface for a content management system, specifically a serverless application, showing various file and directory options for uploading and managing data.&#10;&#10;AI-generated content may be incorrect."/>
+            <wp:cNvGraphicFramePr>
+              <a:graphicFrameLocks xmlns:a="http://schemas.openxmlformats.org/drawingml/2006/main" noChangeAspect="1"/>
+            </wp:cNvGraphicFramePr>
+            <a:graphic xmlns:a="http://schemas.openxmlformats.org/drawingml/2006/main">
+              <a:graphicData uri="http://schemas.openxmlformats.org/drawingml/2006/picture">
+                <pic:pic xmlns:pic="http://schemas.openxmlformats.org/drawingml/2006/picture">
+                  <pic:nvPicPr>
+                    <pic:cNvPr id="983270547" name="Picture 1" descr="The image displays a web interface for a content management system, specifically a serverless application, showing various file and directory options for uploading and managing data.&#10;&#10;AI-generated content may be incorrect."/>
+                    <pic:cNvPicPr/>
+                  </pic:nvPicPr>
+                  <pic:blipFill>
+                    <a:blip r:embed="rId11"/>
+                    <a:stretch>
+                      <a:fillRect/>
+                    </a:stretch>
+                  </pic:blipFill>
+                  <pic:spPr>
+                    <a:xfrm>
+                      <a:off x="0" y="0"/>
+                      <a:ext cx="5731510" cy="2964180"/>
+                    </a:xfrm>
+                    <a:prstGeom prst="rect">
+                      <a:avLst/>
+                    </a:prstGeom>
+                  </pic:spPr>
+                </pic:pic>
+              </a:graphicData>
+            </a:graphic>
+          </wp:inline>
+        </w:drawing>
+      </w:r>
+    </w:p>
+    <w:p>
+      <w:r>
+        <w:lastRenderedPageBreak/>
+        <w:drawing>
+          <wp:inline distT="0" distB="0" distL="0" distR="0" wp14:anchorId="77510457" wp14:editId="3A22FF69">
+            <wp:extent cx="5731510" cy="4034790"/>
+            <wp:effectExtent l="0" t="0" r="2540" b="3810"/>
+            <wp:docPr id="742810976" name="Picture 1" descr="The image displays a table with customer data, including fields such as Customer ID, Name, Age, and Country.&#10;&#10;AI-generated content may be incorrect."/>
+            <wp:cNvGraphicFramePr>
+              <a:graphicFrameLocks xmlns:a="http://schemas.openxmlformats.org/drawingml/2006/main" noChangeAspect="1"/>
+            </wp:cNvGraphicFramePr>
+            <a:graphic xmlns:a="http://schemas.openxmlformats.org/drawingml/2006/main">
+              <a:graphicData uri="http://schemas.openxmlformats.org/drawingml/2006/picture">
+                <pic:pic xmlns:pic="http://schemas.openxmlformats.org/drawingml/2006/picture">
+                  <pic:nvPicPr>
+                    <pic:cNvPr id="742810976" name="Picture 1" descr="The image displays a table with customer data, including fields such as Customer ID, Name, Age, and Country.&#10;&#10;AI-generated content may be incorrect."/>
+                    <pic:cNvPicPr/>
+                  </pic:nvPicPr>
+                  <pic:blipFill>
+                    <a:blip r:embed="rId12"/>
+                    <a:stretch>
+                      <a:fillRect/>
+                    </a:stretch>
+                  </pic:blipFill>
+                  <pic:spPr>
+                    <a:xfrm>
+                      <a:off x="0" y="0"/>
+                      <a:ext cx="5731510" cy="4034790"/>
+                    </a:xfrm>
+                    <a:prstGeom prst="rect">
+                      <a:avLst/>
+                    </a:prstGeom>
+                  </pic:spPr>
+                </pic:pic>
+              </a:graphicData>
+            </a:graphic>
+          </wp:inline>
+        </w:drawing>
+      </w:r>
+    </w:p>
+    <w:p>
+      <w:r>
+        <w:drawing>
+          <wp:inline distT="0" distB="0" distL="0" distR="0" wp14:anchorId="2CBA8E3E" wp14:editId="36A86299">
+            <wp:extent cx="5731510" cy="4281170"/>
+            <wp:effectExtent l="0" t="0" r="2540" b="5080"/>
+            <wp:docPr id="1700379642" name="Picture 1" descr="The image displays a CSV file preview with a list of order details, including order IDs, item names, quantities, and customer IDs.&#10;&#10;AI-generated content may be incorrect."/>
+            <wp:cNvGraphicFramePr>
+              <a:graphicFrameLocks xmlns:a="http://schemas.openxmlformats.org/drawingml/2006/main" noChangeAspect="1"/>
+            </wp:cNvGraphicFramePr>
+            <a:graphic xmlns:a="http://schemas.openxmlformats.org/drawingml/2006/main">
+              <a:graphicData uri="http://schemas.openxmlformats.org/drawingml/2006/picture">
+                <pic:pic xmlns:pic="http://schemas.openxmlformats.org/drawingml/2006/picture">
+                  <pic:nvPicPr>
+                    <pic:cNvPr id="1700379642" name="Picture 1" descr="The image displays a CSV file preview with a list of order details, including order IDs, item names, quantities, and customer IDs.&#10;&#10;AI-generated content may be incorrect."/>
+                    <pic:cNvPicPr/>
+                  </pic:nvPicPr>
+                  <pic:blipFill>
+                    <a:blip r:embed="rId13"/>
+                    <a:stretch>
+                      <a:fillRect/>
+                    </a:stretch>
+                  </pic:blipFill>
+                  <pic:spPr>
+                    <a:xfrm>
+                      <a:off x="0" y="0"/>
+                      <a:ext cx="5731510" cy="4281170"/>
+                    </a:xfrm>
+                    <a:prstGeom prst="rect">
+                      <a:avLst/>
+                    </a:prstGeom>
+                  </pic:spPr>
+                </pic:pic>
+              </a:graphicData>
+            </a:graphic>
+          </wp:inline>
+        </w:drawing>
+      </w:r>
+    </w:p>
+    <w:p>
+      <w:r>
+        <w:lastRenderedPageBreak/>
+        <w:drawing>
+          <wp:inline distT="0" distB="0" distL="0" distR="0" wp14:anchorId="154AB660" wp14:editId="7B0E2C55">
+            <wp:extent cx="5731510" cy="3924935"/>
+            <wp:effectExtent l="0" t="0" r="2540" b="0"/>
+            <wp:docPr id="324359876" name="Picture 1" descr="The image displays a JSON file snippet with an array of three shipping objects, each containing a shipping ID, a pending status, and a customer ID.&#10;&#10;AI-generated content may be incorrect."/>
+            <wp:cNvGraphicFramePr>
+              <a:graphicFrameLocks xmlns:a="http://schemas.openxmlformats.org/drawingml/2006/main" noChangeAspect="1"/>
+            </wp:cNvGraphicFramePr>
+            <a:graphic xmlns:a="http://schemas.openxmlformats.org/drawingml/2006/main">
+              <a:graphicData uri="http://schemas.openxmlformats.org/drawingml/2006/picture">
+                <pic:pic xmlns:pic="http://schemas.openxmlformats.org/drawingml/2006/picture">
+                  <pic:nvPicPr>
+                    <pic:cNvPr id="324359876" name="Picture 1" descr="The image displays a JSON file snippet with an array of three shipping objects, each containing a shipping ID, a pending status, and a customer ID.&#10;&#10;AI-generated content may be incorrect."/>
+                    <pic:cNvPicPr/>
+                  </pic:nvPicPr>
+                  <pic:blipFill>
+                    <a:blip r:embed="rId14"/>
+                    <a:stretch>
+                      <a:fillRect/>
+                    </a:stretch>
+                  </pic:blipFill>
+                  <pic:spPr>
+                    <a:xfrm>
+                      <a:off x="0" y="0"/>
+                      <a:ext cx="5731510" cy="3924935"/>
+                    </a:xfrm>
+                    <a:prstGeom prst="rect">
+                      <a:avLst/>
+                    </a:prstGeom>
+                  </pic:spPr>
+                </pic:pic>
+              </a:graphicData>
+            </a:graphic>
+          </wp:inline>
+        </w:drawing>
+      </w:r>
+    </w:p>
+    <w:p>
+      <w:r>
+        <w:t>Creating silver schema</w:t>
+      </w:r>
+    </w:p>
+    <w:p/>
+    <w:p>
+      <w:r>
+        <w:lastRenderedPageBreak/>
+        <w:drawing>
+          <wp:inline distT="0" distB="0" distL="0" distR="0" wp14:anchorId="35700AC0" wp14:editId="13545D36">
+            <wp:extent cx="5731510" cy="4891405"/>
+            <wp:effectExtent l="0" t="0" r="2540" b="4445"/>
+            <wp:docPr id="1810842653" name="Picture 1" descr="The image displays a user interface for creating a new schema in Unity Catalog, with fields for schema name, storage location, and external location.&#10;&#10;AI-generated content may be incorrect."/>
+            <wp:cNvGraphicFramePr>
+              <a:graphicFrameLocks xmlns:a="http://schemas.openxmlformats.org/drawingml/2006/main" noChangeAspect="1"/>
+            </wp:cNvGraphicFramePr>
+            <a:graphic xmlns:a="http://schemas.openxmlformats.org/drawingml/2006/main">
+              <a:graphicData uri="http://schemas.openxmlformats.org/drawingml/2006/picture">
+                <pic:pic xmlns:pic="http://schemas.openxmlformats.org/drawingml/2006/picture">
+                  <pic:nvPicPr>
+                    <pic:cNvPr id="1810842653" name="Picture 1" descr="The image displays a user interface for creating a new schema in Unity Catalog, with fields for schema name, storage location, and external location.&#10;&#10;AI-generated content may be incorrect."/>
+                    <pic:cNvPicPr/>
+                  </pic:nvPicPr>
+                  <pic:blipFill>
+                    <a:blip r:embed="rId15"/>
+                    <a:stretch>
+                      <a:fillRect/>
+                    </a:stretch>
+                  </pic:blipFill>
+                  <pic:spPr>
+                    <a:xfrm>
+                      <a:off x="0" y="0"/>
+                      <a:ext cx="5731510" cy="4891405"/>
+                    </a:xfrm>
+                    <a:prstGeom prst="rect">
+                      <a:avLst/>
+                    </a:prstGeom>
+                  </pic:spPr>
+                </pic:pic>
+              </a:graphicData>
+            </a:graphic>
+          </wp:inline>
+        </w:drawing>
+      </w:r>
+    </w:p>
+    <w:p>
+      <w:r>
+        <w:t>Creating gold schema</w:t>
+      </w:r>
+    </w:p>
+    <w:p>
+      <w:r>
+        <w:lastRenderedPageBreak/>
+        <w:drawing>
+          <wp:inline distT="0" distB="0" distL="0" distR="0" wp14:anchorId="6D809770" wp14:editId="0508DDE1">
+            <wp:extent cx="5731510" cy="3680460"/>
+            <wp:effectExtent l="0" t="0" r="2540" b="0"/>
+            <wp:docPr id="236564467" name="Picture 1" descr="The image displays a user interface for the Catalog Explorer, showing options to create a new schema, set storage locations, and manage external locations for a serverless warehouse.&#10;&#10;AI-generated content may be incorrect."/>
+            <wp:cNvGraphicFramePr>
+              <a:graphicFrameLocks xmlns:a="http://schemas.openxmlformats.org/drawingml/2006/main" noChangeAspect="1"/>
+            </wp:cNvGraphicFramePr>
+            <a:graphic xmlns:a="http://schemas.openxmlformats.org/drawingml/2006/main">
+              <a:graphicData uri="http://schemas.openxmlformats.org/drawingml/2006/picture">
+                <pic:pic xmlns:pic="http://schemas.openxmlformats.org/drawingml/2006/picture">
+                  <pic:nvPicPr>
+                    <pic:cNvPr id="236564467" name="Picture 1" descr="The image displays a user interface for the Catalog Explorer, showing options to create a new schema, set storage locations, and manage external locations for a serverless warehouse.&#10;&#10;AI-generated content may be incorrect."/>
+                    <pic:cNvPicPr/>
+                  </pic:nvPicPr>
+                  <pic:blipFill>
+                    <a:blip r:embed="rId16"/>
+                    <a:stretch>
+                      <a:fillRect/>
+                    </a:stretch>
+                  </pic:blipFill>
+                  <pic:spPr>
+                    <a:xfrm>
+                      <a:off x="0" y="0"/>
+                      <a:ext cx="5731510" cy="3680460"/>
+                    </a:xfrm>
+                    <a:prstGeom prst="rect">
+                      <a:avLst/>
+                    </a:prstGeom>
+                  </pic:spPr>
+                </pic:pic>
+              </a:graphicData>
+            </a:graphic>
+          </wp:inline>
+        </w:drawing>
+      </w:r>
+    </w:p>
+    <w:p>
+      <w:r>
+        <w:drawing>
+          <wp:inline distT="0" distB="0" distL="0" distR="0" wp14:anchorId="0411C6F2" wp14:editId="585B452B">
+            <wp:extent cx="5731510" cy="2626995"/>
+            <wp:effectExtent l="0" t="0" r="2540" b="1905"/>
+            <wp:docPr id="62176777" name="Picture 1" descr="The image displays a dashboard with various tabs and options for managing a serverless infrastructure, including workspaces, schemas, and permissions.&#10;&#10;AI-generated content may be incorrect."/>
+            <wp:cNvGraphicFramePr>
+              <a:graphicFrameLocks xmlns:a="http://schemas.openxmlformats.org/drawingml/2006/main" noChangeAspect="1"/>
+            </wp:cNvGraphicFramePr>
+            <a:graphic xmlns:a="http://schemas.openxmlformats.org/drawingml/2006/main">
+              <a:graphicData uri="http://schemas.openxmlformats.org/drawingml/2006/picture">
+                <pic:pic xmlns:pic="http://schemas.openxmlformats.org/drawingml/2006/picture">
+                  <pic:nvPicPr>
+                    <pic:cNvPr id="62176777" name="Picture 1" descr="The image displays a dashboard with various tabs and options for managing a serverless infrastructure, including workspaces, schemas, and permissions.&#10;&#10;AI-generated content may be incorrect."/>
+                    <pic:cNvPicPr/>
+                  </pic:nvPicPr>
+                  <pic:blipFill>
+                    <a:blip r:embed="rId17"/>
+                    <a:stretch>
+                      <a:fillRect/>
+                    </a:stretch>
+                  </pic:blipFill>
+                  <pic:spPr>
+                    <a:xfrm>
+                      <a:off x="0" y="0"/>
+                      <a:ext cx="5731510" cy="2626995"/>
+                    </a:xfrm>
+                    <a:prstGeom prst="rect">
+                      <a:avLst/>
+                    </a:prstGeom>
+                  </pic:spPr>
+                </pic:pic>
+              </a:graphicData>
+            </a:graphic>
+          </wp:inline>
+        </w:drawing>
+      </w:r>
+    </w:p>
+    <w:p/>
     <w:sectPr>
       <w:pgSz w:w="11906" w:h="16838"/>
       <w:pgMar w:top="1440" w:right="1440" w:bottom="1440" w:left="1440" w:header="708" w:footer="708" w:gutter="0"/>
@@ -529,7 +1061,6 @@
     <w:next w:val="Normal"/>
     <w:link w:val="Heading2Char"/>
     <w:uiPriority w:val="9"/>
-    <w:semiHidden/>
     <w:unhideWhenUsed/>
     <w:qFormat/>
     <w:rsid w:val="00DC6453"/>
@@ -704,7 +1235,6 @@
   <w:style w:type="character" w:default="1" w:styleId="DefaultParagraphFont">
     <w:name w:val="Default Paragraph Font"/>
     <w:uiPriority w:val="1"/>
-    <w:semiHidden/>
     <w:unhideWhenUsed/>
   </w:style>
   <w:style w:type="table" w:default="1" w:styleId="TableNormal">
@@ -746,7 +1276,6 @@
     <w:basedOn w:val="DefaultParagraphFont"/>
     <w:link w:val="Heading2"/>
     <w:uiPriority w:val="9"/>
-    <w:semiHidden/>
     <w:rsid w:val="00DC6453"/>
     <w:rPr>
       <w:rFonts w:asciiTheme="majorHAnsi" w:eastAsiaTheme="majorEastAsia" w:hAnsiTheme="majorHAnsi" w:cstheme="majorBidi"/>

</xml_diff>

<commit_message>
test case development for orders table
</commit_message>
<xml_diff>
--- a/Signing up to databricks.docx
+++ b/Signing up to databricks.docx
@@ -124,6 +124,9 @@
     </w:p>
     <w:p>
       <w:r>
+        <w:rPr>
+          <w:noProof/>
+        </w:rPr>
         <w:drawing>
           <wp:inline distT="0" distB="0" distL="0" distR="0" wp14:anchorId="2A307AF3" wp14:editId="6E36B6A5">
             <wp:extent cx="5731510" cy="2913380"/>
@@ -163,6 +166,9 @@
     </w:p>
     <w:p>
       <w:r>
+        <w:rPr>
+          <w:noProof/>
+        </w:rPr>
         <w:drawing>
           <wp:inline distT="0" distB="0" distL="0" distR="0" wp14:anchorId="2DA900AA" wp14:editId="70413890">
             <wp:extent cx="5731510" cy="2579370"/>
@@ -207,6 +213,9 @@
     </w:p>
     <w:p>
       <w:r>
+        <w:rPr>
+          <w:noProof/>
+        </w:rPr>
         <w:lastRenderedPageBreak/>
         <w:drawing>
           <wp:inline distT="0" distB="0" distL="0" distR="0" wp14:anchorId="0FCD73F3" wp14:editId="7C8FF1DD">
@@ -252,6 +261,9 @@
     </w:p>
     <w:p>
       <w:r>
+        <w:rPr>
+          <w:noProof/>
+        </w:rPr>
         <w:drawing>
           <wp:inline distT="0" distB="0" distL="0" distR="0" wp14:anchorId="2FA230C9" wp14:editId="4E982F23">
             <wp:extent cx="3261643" cy="1546994"/>
@@ -291,6 +303,9 @@
     </w:p>
     <w:p>
       <w:r>
+        <w:rPr>
+          <w:noProof/>
+        </w:rPr>
         <w:lastRenderedPageBreak/>
         <w:drawing>
           <wp:inline distT="0" distB="0" distL="0" distR="0" wp14:anchorId="651722D7" wp14:editId="2D43FCD3">
@@ -336,6 +351,9 @@
     </w:p>
     <w:p>
       <w:r>
+        <w:rPr>
+          <w:noProof/>
+        </w:rPr>
         <w:drawing>
           <wp:inline distT="0" distB="0" distL="0" distR="0" wp14:anchorId="0B62BAD6" wp14:editId="091AC199">
             <wp:extent cx="5731510" cy="2964180"/>
@@ -375,6 +393,9 @@
     </w:p>
     <w:p>
       <w:r>
+        <w:rPr>
+          <w:noProof/>
+        </w:rPr>
         <w:lastRenderedPageBreak/>
         <w:drawing>
           <wp:inline distT="0" distB="0" distL="0" distR="0" wp14:anchorId="77510457" wp14:editId="3A22FF69">
@@ -415,6 +436,9 @@
     </w:p>
     <w:p>
       <w:r>
+        <w:rPr>
+          <w:noProof/>
+        </w:rPr>
         <w:drawing>
           <wp:inline distT="0" distB="0" distL="0" distR="0" wp14:anchorId="2CBA8E3E" wp14:editId="36A86299">
             <wp:extent cx="5731510" cy="4281170"/>
@@ -454,6 +478,9 @@
     </w:p>
     <w:p>
       <w:r>
+        <w:rPr>
+          <w:noProof/>
+        </w:rPr>
         <w:lastRenderedPageBreak/>
         <w:drawing>
           <wp:inline distT="0" distB="0" distL="0" distR="0" wp14:anchorId="154AB660" wp14:editId="7B0E2C55">
@@ -500,6 +527,9 @@
     <w:p/>
     <w:p>
       <w:r>
+        <w:rPr>
+          <w:noProof/>
+        </w:rPr>
         <w:lastRenderedPageBreak/>
         <w:drawing>
           <wp:inline distT="0" distB="0" distL="0" distR="0" wp14:anchorId="35700AC0" wp14:editId="13545D36">
@@ -545,6 +575,9 @@
     </w:p>
     <w:p>
       <w:r>
+        <w:rPr>
+          <w:noProof/>
+        </w:rPr>
         <w:lastRenderedPageBreak/>
         <w:drawing>
           <wp:inline distT="0" distB="0" distL="0" distR="0" wp14:anchorId="6D809770" wp14:editId="0508DDE1">
@@ -585,6 +618,9 @@
     </w:p>
     <w:p>
       <w:r>
+        <w:rPr>
+          <w:noProof/>
+        </w:rPr>
         <w:drawing>
           <wp:inline distT="0" distB="0" distL="0" distR="0" wp14:anchorId="0411C6F2" wp14:editId="585B452B">
             <wp:extent cx="5731510" cy="2626995"/>
@@ -622,6 +658,437 @@
         </w:drawing>
       </w:r>
     </w:p>
+    <w:p>
+      <w:r>
+        <w:t xml:space="preserve">Tables creation in silver layer </w:t>
+      </w:r>
+    </w:p>
+    <w:p>
+      <w:r>
+        <w:lastRenderedPageBreak/>
+        <w:drawing>
+          <wp:inline distT="0" distB="0" distL="0" distR="0" wp14:anchorId="3822A2C9" wp14:editId="0628D765">
+            <wp:extent cx="5731510" cy="4287520"/>
+            <wp:effectExtent l="0" t="0" r="2540" b="0"/>
+            <wp:docPr id="1883369899" name="Picture 1" descr="The image displays a snippet of SQL code, including the creation of a new table named 'customers' with specified columns and a primary key constraint.&#10;&#10;AI-generated content may be incorrect."/>
+            <wp:cNvGraphicFramePr>
+              <a:graphicFrameLocks xmlns:a="http://schemas.openxmlformats.org/drawingml/2006/main" noChangeAspect="1"/>
+            </wp:cNvGraphicFramePr>
+            <a:graphic xmlns:a="http://schemas.openxmlformats.org/drawingml/2006/main">
+              <a:graphicData uri="http://schemas.openxmlformats.org/drawingml/2006/picture">
+                <pic:pic xmlns:pic="http://schemas.openxmlformats.org/drawingml/2006/picture">
+                  <pic:nvPicPr>
+                    <pic:cNvPr id="1883369899" name="Picture 1" descr="The image displays a snippet of SQL code, including the creation of a new table named 'customers' with specified columns and a primary key constraint.&#10;&#10;AI-generated content may be incorrect."/>
+                    <pic:cNvPicPr/>
+                  </pic:nvPicPr>
+                  <pic:blipFill>
+                    <a:blip r:embed="rId18"/>
+                    <a:stretch>
+                      <a:fillRect/>
+                    </a:stretch>
+                  </pic:blipFill>
+                  <pic:spPr>
+                    <a:xfrm>
+                      <a:off x="0" y="0"/>
+                      <a:ext cx="5731510" cy="4287520"/>
+                    </a:xfrm>
+                    <a:prstGeom prst="rect">
+                      <a:avLst/>
+                    </a:prstGeom>
+                  </pic:spPr>
+                </pic:pic>
+              </a:graphicData>
+            </a:graphic>
+          </wp:inline>
+        </w:drawing>
+      </w:r>
+    </w:p>
+    <w:p>
+      <w:r>
+        <w:drawing>
+          <wp:inline distT="0" distB="0" distL="0" distR="0" wp14:anchorId="13ABF9A9" wp14:editId="51C17B49">
+            <wp:extent cx="5220152" cy="3330229"/>
+            <wp:effectExtent l="0" t="0" r="0" b="3810"/>
+            <wp:docPr id="1126774411" name="Picture 1" descr="The provided text describes the creation of a SQL table named 'shipping' with columns for shipping ID, status, and customer ID, including primary and foreign key constraints.&#10;&#10;AI-generated content may be incorrect."/>
+            <wp:cNvGraphicFramePr>
+              <a:graphicFrameLocks xmlns:a="http://schemas.openxmlformats.org/drawingml/2006/main" noChangeAspect="1"/>
+            </wp:cNvGraphicFramePr>
+            <a:graphic xmlns:a="http://schemas.openxmlformats.org/drawingml/2006/main">
+              <a:graphicData uri="http://schemas.openxmlformats.org/drawingml/2006/picture">
+                <pic:pic xmlns:pic="http://schemas.openxmlformats.org/drawingml/2006/picture">
+                  <pic:nvPicPr>
+                    <pic:cNvPr id="1126774411" name="Picture 1" descr="The provided text describes the creation of a SQL table named 'shipping' with columns for shipping ID, status, and customer ID, including primary and foreign key constraints.&#10;&#10;AI-generated content may be incorrect."/>
+                    <pic:cNvPicPr/>
+                  </pic:nvPicPr>
+                  <pic:blipFill>
+                    <a:blip r:embed="rId19"/>
+                    <a:stretch>
+                      <a:fillRect/>
+                    </a:stretch>
+                  </pic:blipFill>
+                  <pic:spPr>
+                    <a:xfrm>
+                      <a:off x="0" y="0"/>
+                      <a:ext cx="5220152" cy="3330229"/>
+                    </a:xfrm>
+                    <a:prstGeom prst="rect">
+                      <a:avLst/>
+                    </a:prstGeom>
+                  </pic:spPr>
+                </pic:pic>
+              </a:graphicData>
+            </a:graphic>
+          </wp:inline>
+        </w:drawing>
+      </w:r>
+    </w:p>
+    <w:p/>
+    <w:p>
+      <w:proofErr w:type="spellStart"/>
+      <w:proofErr w:type="gramStart"/>
+      <w:r>
+        <w:t>Ddl</w:t>
+      </w:r>
+      <w:proofErr w:type="spellEnd"/>
+      <w:r>
+        <w:t xml:space="preserve"> :</w:t>
+      </w:r>
+      <w:proofErr w:type="gramEnd"/>
+      <w:r>
+        <w:t xml:space="preserve"> </w:t>
+      </w:r>
+    </w:p>
+    <w:p/>
+    <w:p/>
+    <w:p>
+      <w:r>
+        <w:t xml:space="preserve">-- customers table creation </w:t>
+      </w:r>
+    </w:p>
+    <w:p/>
+    <w:p>
+      <w:r>
+        <w:t>-- CREATE TABLE customers (</w:t>
+      </w:r>
+    </w:p>
+    <w:p>
+      <w:r>
+        <w:t xml:space="preserve">--     </w:t>
+      </w:r>
+      <w:proofErr w:type="spellStart"/>
+      <w:r>
+        <w:t>customer_id</w:t>
+      </w:r>
+      <w:proofErr w:type="spellEnd"/>
+      <w:r>
+        <w:t xml:space="preserve"> INT NOT NULL,</w:t>
+      </w:r>
+    </w:p>
+    <w:p>
+      <w:r>
+        <w:t xml:space="preserve">--     </w:t>
+      </w:r>
+      <w:proofErr w:type="spellStart"/>
+      <w:r>
+        <w:t>first_name</w:t>
+      </w:r>
+      <w:proofErr w:type="spellEnd"/>
+      <w:r>
+        <w:t xml:space="preserve"> STRING NOT NULL,</w:t>
+      </w:r>
+    </w:p>
+    <w:p>
+      <w:r>
+        <w:t xml:space="preserve">--     </w:t>
+      </w:r>
+      <w:proofErr w:type="spellStart"/>
+      <w:r>
+        <w:t>last_name</w:t>
+      </w:r>
+      <w:proofErr w:type="spellEnd"/>
+      <w:r>
+        <w:t xml:space="preserve"> STRING NOT NULL,</w:t>
+      </w:r>
+    </w:p>
+    <w:p>
+      <w:r>
+        <w:t>--     age INT,</w:t>
+      </w:r>
+    </w:p>
+    <w:p>
+      <w:r>
+        <w:t>--     country STRING,</w:t>
+      </w:r>
+    </w:p>
+    <w:p/>
+    <w:p>
+      <w:r>
+        <w:t xml:space="preserve">--     CONSTRAINT </w:t>
+      </w:r>
+      <w:proofErr w:type="spellStart"/>
+      <w:r>
+        <w:t>customers_pk</w:t>
+      </w:r>
+      <w:proofErr w:type="spellEnd"/>
+      <w:r>
+        <w:t xml:space="preserve"> PRIMARY KEY (</w:t>
+      </w:r>
+      <w:proofErr w:type="spellStart"/>
+      <w:r>
+        <w:t>customer_id</w:t>
+      </w:r>
+      <w:proofErr w:type="spellEnd"/>
+      <w:r>
+        <w:t>)</w:t>
+      </w:r>
+    </w:p>
+    <w:p>
+      <w:r>
+        <w:t>-- )</w:t>
+      </w:r>
+    </w:p>
+    <w:p>
+      <w:r>
+        <w:t>-- USING DELTA;</w:t>
+      </w:r>
+    </w:p>
+    <w:p/>
+    <w:p>
+      <w:r>
+        <w:t xml:space="preserve">--orders table creation </w:t>
+      </w:r>
+    </w:p>
+    <w:p/>
+    <w:p>
+      <w:r>
+        <w:t>-- CREATE TABLE orders (</w:t>
+      </w:r>
+    </w:p>
+    <w:p>
+      <w:r>
+        <w:t xml:space="preserve">--     </w:t>
+      </w:r>
+      <w:proofErr w:type="spellStart"/>
+      <w:r>
+        <w:t>order_id</w:t>
+      </w:r>
+      <w:proofErr w:type="spellEnd"/>
+      <w:r>
+        <w:t xml:space="preserve"> INT NOT NULL,</w:t>
+      </w:r>
+    </w:p>
+    <w:p>
+      <w:r>
+        <w:t>--     item STRING NOT NULL,</w:t>
+      </w:r>
+    </w:p>
+    <w:p>
+      <w:r>
+        <w:t xml:space="preserve">--     amount </w:t>
+      </w:r>
+      <w:proofErr w:type="gramStart"/>
+      <w:r>
+        <w:t>DECIMAL(</w:t>
+      </w:r>
+      <w:proofErr w:type="gramEnd"/>
+      <w:r>
+        <w:t>10,2) NOT NULL,</w:t>
+      </w:r>
+    </w:p>
+    <w:p>
+      <w:r>
+        <w:t xml:space="preserve">--     </w:t>
+      </w:r>
+      <w:proofErr w:type="spellStart"/>
+      <w:r>
+        <w:t>customer_id</w:t>
+      </w:r>
+      <w:proofErr w:type="spellEnd"/>
+      <w:r>
+        <w:t xml:space="preserve"> INT NOT NULL,</w:t>
+      </w:r>
+    </w:p>
+    <w:p/>
+    <w:p>
+      <w:r>
+        <w:t xml:space="preserve">--     CONSTRAINT </w:t>
+      </w:r>
+      <w:proofErr w:type="spellStart"/>
+      <w:r>
+        <w:t>orders_pk</w:t>
+      </w:r>
+      <w:proofErr w:type="spellEnd"/>
+      <w:r>
+        <w:t xml:space="preserve"> PRIMARY KEY (</w:t>
+      </w:r>
+      <w:proofErr w:type="spellStart"/>
+      <w:r>
+        <w:t>order_id</w:t>
+      </w:r>
+      <w:proofErr w:type="spellEnd"/>
+      <w:r>
+        <w:t>),</w:t>
+      </w:r>
+    </w:p>
+    <w:p>
+      <w:r>
+        <w:t xml:space="preserve">--     CONSTRAINT </w:t>
+      </w:r>
+      <w:proofErr w:type="spellStart"/>
+      <w:r>
+        <w:t>orders_customer_fk</w:t>
+      </w:r>
+      <w:proofErr w:type="spellEnd"/>
+      <w:r>
+        <w:t xml:space="preserve"> FOREIGN KEY (</w:t>
+      </w:r>
+      <w:proofErr w:type="spellStart"/>
+      <w:r>
+        <w:t>customer_id</w:t>
+      </w:r>
+      <w:proofErr w:type="spellEnd"/>
+      <w:r>
+        <w:t>)</w:t>
+      </w:r>
+    </w:p>
+    <w:p>
+      <w:r>
+        <w:t>--         REFERENCES customers(</w:t>
+      </w:r>
+      <w:proofErr w:type="spellStart"/>
+      <w:r>
+        <w:t>customer_id</w:t>
+      </w:r>
+      <w:proofErr w:type="spellEnd"/>
+      <w:r>
+        <w:t>)</w:t>
+      </w:r>
+    </w:p>
+    <w:p>
+      <w:r>
+        <w:t>-- )</w:t>
+      </w:r>
+    </w:p>
+    <w:p>
+      <w:r>
+        <w:t>-- USING DELTA;</w:t>
+      </w:r>
+    </w:p>
+    <w:p/>
+    <w:p>
+      <w:r>
+        <w:lastRenderedPageBreak/>
+        <w:t xml:space="preserve">--shipping table creation </w:t>
+      </w:r>
+    </w:p>
+    <w:p/>
+    <w:p>
+      <w:r>
+        <w:t>CREATE TABLE shipping (</w:t>
+      </w:r>
+    </w:p>
+    <w:p>
+      <w:r>
+        <w:t xml:space="preserve">    </w:t>
+      </w:r>
+      <w:proofErr w:type="spellStart"/>
+      <w:r>
+        <w:t>shipping_id</w:t>
+      </w:r>
+      <w:proofErr w:type="spellEnd"/>
+      <w:r>
+        <w:t xml:space="preserve"> INT NOT NULL,</w:t>
+      </w:r>
+    </w:p>
+    <w:p>
+      <w:r>
+        <w:t>    status STRING NOT NULL,</w:t>
+      </w:r>
+    </w:p>
+    <w:p>
+      <w:r>
+        <w:t xml:space="preserve">    </w:t>
+      </w:r>
+      <w:proofErr w:type="spellStart"/>
+      <w:r>
+        <w:t>customer_id</w:t>
+      </w:r>
+      <w:proofErr w:type="spellEnd"/>
+      <w:r>
+        <w:t xml:space="preserve"> INT NOT NULL,</w:t>
+      </w:r>
+    </w:p>
+    <w:p/>
+    <w:p>
+      <w:r>
+        <w:t xml:space="preserve">    CONSTRAINT </w:t>
+      </w:r>
+      <w:proofErr w:type="spellStart"/>
+      <w:r>
+        <w:t>shipping_pk</w:t>
+      </w:r>
+      <w:proofErr w:type="spellEnd"/>
+      <w:r>
+        <w:t xml:space="preserve"> PRIMARY KEY (</w:t>
+      </w:r>
+      <w:proofErr w:type="spellStart"/>
+      <w:r>
+        <w:t>shipping_id</w:t>
+      </w:r>
+      <w:proofErr w:type="spellEnd"/>
+      <w:r>
+        <w:t>),</w:t>
+      </w:r>
+    </w:p>
+    <w:p>
+      <w:r>
+        <w:t xml:space="preserve">    CONSTRAINT </w:t>
+      </w:r>
+      <w:proofErr w:type="spellStart"/>
+      <w:r>
+        <w:t>shipping_customer_fk</w:t>
+      </w:r>
+      <w:proofErr w:type="spellEnd"/>
+      <w:r>
+        <w:t xml:space="preserve"> FOREIGN KEY (</w:t>
+      </w:r>
+      <w:proofErr w:type="spellStart"/>
+      <w:r>
+        <w:t>customer_id</w:t>
+      </w:r>
+      <w:proofErr w:type="spellEnd"/>
+      <w:r>
+        <w:t>)</w:t>
+      </w:r>
+    </w:p>
+    <w:p>
+      <w:r>
+        <w:t>        REFERENCES customers(</w:t>
+      </w:r>
+      <w:proofErr w:type="spellStart"/>
+      <w:r>
+        <w:t>customer_id</w:t>
+      </w:r>
+      <w:proofErr w:type="spellEnd"/>
+      <w:r>
+        <w:t>)</w:t>
+      </w:r>
+    </w:p>
+    <w:p>
+      <w:r>
+        <w:t>)</w:t>
+      </w:r>
+    </w:p>
+    <w:p>
+      <w:r>
+        <w:t>USING DELTA;</w:t>
+      </w:r>
+    </w:p>
+    <w:p/>
+    <w:p/>
+    <w:p/>
+    <w:p/>
+    <w:p/>
     <w:p/>
     <w:sectPr>
       <w:pgSz w:w="11906" w:h="16838"/>

</xml_diff>